<commit_message>
Correct 2026 spreadsheet source ID and rebuild snapshot
2026 source was pointing at the wrong spreadsheet. Updated companies.json to
the correct ID (1lxBMegXKCiBZZpnD16WTp4hZm3P6tgvnH5lqQ5q1V0I) and regenerated
data/snapshot.demo.json (2026 now 309 records). Doc updated to match.

Co-Authored-By: Claude Opus 4.8 <noreply@anthropic.com>
</commit_message>
<xml_diff>
--- a/情資蒐集來源說明.docx
+++ b/情資蒐集來源說明.docx
@@ -3,11 +3,6 @@
 <w:document xmlns:wpc="http://schemas.microsoft.com/office/word/2010/wordprocessingCanvas" xmlns:cx="http://schemas.microsoft.com/office/drawing/2014/chartex" xmlns:cx1="http://schemas.microsoft.com/office/drawing/2015/9/8/chartex" xmlns:cx2="http://schemas.microsoft.com/office/drawing/2015/10/21/chartex" xmlns:cx3="http://schemas.microsoft.com/office/drawing/2016/5/9/chartex" xmlns:cx4="http://schemas.microsoft.com/office/drawing/2016/5/10/chartex" xmlns:cx5="http://schemas.microsoft.com/office/drawing/2016/5/11/chartex" xmlns:cx6="http://schemas.microsoft.com/office/drawing/2016/5/12/chartex" xmlns:cx7="http://schemas.microsoft.com/office/drawing/2016/5/13/chartex" xmlns:cx8="http://schemas.microsoft.com/office/drawing/2016/5/14/chartex" xmlns:mc="http://schemas.openxmlformats.org/markup-compatibility/2006" xmlns:aink="http://schemas.microsoft.com/office/drawing/2016/ink" xmlns:am3d="http://schemas.microsoft.com/office/drawing/2017/model3d" xmlns:o="urn:schemas-microsoft-com:office:office" xmlns:oel="http://schemas.microsoft.com/office/2019/extlst" xmlns:r="http://schemas.openxmlformats.org/officeDocument/2006/relationships" xmlns:m="http://schemas.openxmlformats.org/officeDocument/2006/math" xmlns:v="urn:schemas-microsoft-com:vml" xmlns:wp14="http://schemas.microsoft.com/office/word/2010/wordprocessingDrawing" xmlns:wp="http://schemas.openxmlformats.org/drawingml/2006/wordprocessingDrawing" xmlns:w10="urn:schemas-microsoft-com:office:word" xmlns:w="http://schemas.openxmlformats.org/wordprocessingml/2006/main" xmlns:w14="http://schemas.microsoft.com/office/word/2010/wordml" xmlns:w15="http://schemas.microsoft.com/office/word/2012/wordml" xmlns:w16cex="http://schemas.microsoft.com/office/word/2018/wordml/cex" xmlns:w16cid="http://schemas.microsoft.com/office/word/2016/wordml/cid" xmlns:w16="http://schemas.microsoft.com/office/word/2018/wordml" xmlns:w16du="http://schemas.microsoft.com/office/word/2023/wordml/word16du" xmlns:w16sdtdh="http://schemas.microsoft.com/office/word/2020/wordml/sdtdatahash" xmlns:w16sdtfl="http://schemas.microsoft.com/office/word/2024/wordml/sdtformatlock" xmlns:w16se="http://schemas.microsoft.com/office/word/2015/wordml/symex" xmlns:wpg="http://schemas.microsoft.com/office/word/2010/wordprocessingGroup" xmlns:wpi="http://schemas.microsoft.com/office/word/2010/wordprocessingInk" xmlns:wne="http://schemas.microsoft.com/office/word/2006/wordml" xmlns:wps="http://schemas.microsoft.com/office/word/2010/wordprocessingShape" mc:Ignorable="w14 w15 w16se w16cid w16 w16cex w16sdtdh w16sdtfl w16du wp14">
   <w:body>
     <w:p>
-      <w:pPr>
-        <w:rPr>
-          <w:rFonts w:hint="eastAsia"/>
-        </w:rPr>
-      </w:pPr>
       <w:r>
         <w:rPr>
           <w:rFonts w:hint="eastAsia"/>
@@ -162,14 +157,9 @@
         </w:rPr>
         <w:t>年：</w:t>
       </w:r>
-      <w:hyperlink r:id="rId4" w:history="1">
-        <w:r>
-          <w:rPr>
-            <w:rStyle w:val="ae"/>
-          </w:rPr>
-          <w:t>https://docs.google.com/spreadsheets/d/1MWqqXu8gdwHHrFc17Do1hr929dBvhnz-adtXsq3zfLo/</w:t>
-        </w:r>
-      </w:hyperlink>
+      <w:r>
+        <w:t>https://docs.google.com/spreadsheets/d/1lxBMegXKCiBZZpnD16WTp4hZm3P6tgvnH5lqQ5q1V0I/</w:t>
+      </w:r>
     </w:p>
     <w:p>
       <w:r>
@@ -184,7 +174,7 @@
         </w:rPr>
         <w:t>年：</w:t>
       </w:r>
-      <w:hyperlink r:id="rId5" w:history="1">
+      <w:hyperlink r:id="rId4" w:history="1">
         <w:r>
           <w:rPr>
             <w:rStyle w:val="ae"/>
@@ -208,7 +198,7 @@
       </w:r>
     </w:p>
     <w:p>
-      <w:hyperlink r:id="rId6" w:history="1">
+      <w:hyperlink r:id="rId5" w:history="1">
         <w:r>
           <w:rPr>
             <w:rStyle w:val="ae"/>
@@ -232,7 +222,7 @@
       </w:r>
     </w:p>
     <w:p>
-      <w:hyperlink r:id="rId7" w:history="1">
+      <w:hyperlink r:id="rId6" w:history="1">
         <w:r>
           <w:rPr>
             <w:rStyle w:val="ae"/>
@@ -241,13 +231,7 @@
         </w:r>
       </w:hyperlink>
     </w:p>
-    <w:p>
-      <w:pPr>
-        <w:rPr>
-          <w:rFonts w:hint="eastAsia"/>
-        </w:rPr>
-      </w:pPr>
-    </w:p>
+    <w:p/>
     <w:sectPr>
       <w:pgSz w:w="11906" w:h="16838"/>
       <w:pgMar w:top="1440" w:right="1800" w:bottom="1440" w:left="1800" w:header="851" w:footer="992" w:gutter="0"/>

</xml_diff>